<commit_message>
Updated resume - added "This is my company." to avoid confusion, and added AR/VR resume in PDF format.
</commit_message>
<xml_diff>
--- a/resume/triboletti_andy_resume-latest.docx
+++ b/resume/triboletti_andy_resume-latest.docx
@@ -1668,6 +1668,37 @@
           <w:szCs w:val="20"/>
         </w:rPr>
       </w:pPr>
+    </w:p>
+    <w:p>
+      <w:pPr>
+        <w:pStyle w:val="Body A"/>
+        <w:widowControl w:val="0"/>
+        <w:numPr>
+          <w:ilvl w:val="0"/>
+          <w:numId w:val="4"/>
+        </w:numPr>
+        <w:bidi w:val="0"/>
+        <w:spacing w:line="224" w:lineRule="auto"/>
+        <w:ind w:right="0"/>
+        <w:jc w:val="left"/>
+        <w:rPr>
+          <w:rFonts w:ascii="Helvetica" w:hAnsi="Helvetica"/>
+          <w:sz w:val="20"/>
+          <w:szCs w:val="20"/>
+          <w:rtl w:val="0"/>
+          <w:lang w:val="en-US"/>
+        </w:rPr>
+      </w:pPr>
+      <w:r>
+        <w:rPr>
+          <w:rFonts w:ascii="Helvetica" w:hAnsi="Helvetica"/>
+          <w:sz w:val="20"/>
+          <w:szCs w:val="20"/>
+          <w:rtl w:val="0"/>
+          <w:lang w:val="en-US"/>
+        </w:rPr>
+        <w:t>This is my company.</w:t>
+      </w:r>
     </w:p>
     <w:p>
       <w:pPr>

</xml_diff>